<commit_message>
some minor changes to references
</commit_message>
<xml_diff>
--- a/Documents/Proposal WEB.docx
+++ b/Documents/Proposal WEB.docx
@@ -1,6 +1,6 @@
 
 <file path=word/document.xml><?xml version="1.0" encoding="utf-8"?>
-<w:document xmlns:wpc="http://schemas.microsoft.com/office/word/2010/wordprocessingCanvas" xmlns:cx="http://schemas.microsoft.com/office/drawing/2014/chartex" xmlns:cx1="http://schemas.microsoft.com/office/drawing/2015/9/8/chartex" xmlns:cx2="http://schemas.microsoft.com/office/drawing/2015/10/21/chartex" xmlns:cx3="http://schemas.microsoft.com/office/drawing/2016/5/9/chartex" xmlns:cx4="http://schemas.microsoft.com/office/drawing/2016/5/10/chartex" xmlns:cx5="http://schemas.microsoft.com/office/drawing/2016/5/11/chartex" xmlns:cx6="http://schemas.microsoft.com/office/drawing/2016/5/12/chartex" xmlns:cx7="http://schemas.microsoft.com/office/drawing/2016/5/13/chartex" xmlns:cx8="http://schemas.microsoft.com/office/drawing/2016/5/14/chartex" xmlns:mc="http://schemas.openxmlformats.org/markup-compatibility/2006" xmlns:aink="http://schemas.microsoft.com/office/drawing/2016/ink" xmlns:am3d="http://schemas.microsoft.com/office/drawing/2017/model3d" xmlns:o="urn:schemas-microsoft-com:office:office" xmlns:oel="http://schemas.microsoft.com/office/2019/extlst" xmlns:r="http://schemas.openxmlformats.org/officeDocument/2006/relationships" xmlns:m="http://schemas.openxmlformats.org/officeDocument/2006/math" xmlns:v="urn:schemas-microsoft-com:vml" xmlns:wp14="http://schemas.microsoft.com/office/word/2010/wordprocessingDrawing" xmlns:wp="http://schemas.openxmlformats.org/drawingml/2006/wordprocessingDrawing" xmlns:w10="urn:schemas-microsoft-com:office:word" xmlns:w="http://schemas.openxmlformats.org/wordprocessingml/2006/main" xmlns:w14="http://schemas.microsoft.com/office/word/2010/wordml" xmlns:w15="http://schemas.microsoft.com/office/word/2012/wordml" xmlns:w16cex="http://schemas.microsoft.com/office/word/2018/wordml/cex" xmlns:w16cid="http://schemas.microsoft.com/office/word/2016/wordml/cid" xmlns:w16="http://schemas.microsoft.com/office/word/2018/wordml" xmlns:w16du="http://schemas.microsoft.com/office/word/2023/wordml/word16du" xmlns:w16sdtdh="http://schemas.microsoft.com/office/word/2020/wordml/sdtdatahash" xmlns:w16sdtfl="http://schemas.microsoft.com/office/word/2024/wordml/sdtformatlock" xmlns:w16se="http://schemas.microsoft.com/office/word/2015/wordml/symex" xmlns:wpg="http://schemas.microsoft.com/office/word/2010/wordprocessingGroup" xmlns:wpi="http://schemas.microsoft.com/office/word/2010/wordprocessingInk" xmlns:wne="http://schemas.microsoft.com/office/word/2006/wordml" xmlns:wps="http://schemas.microsoft.com/office/word/2010/wordprocessingShape" mc:Ignorable="w14 w15 w16se w16cid w16 w16cex w16sdtdh w16sdtfl w16du wp14">
+<w:document xmlns:wpc="http://schemas.microsoft.com/office/word/2010/wordprocessingCanvas" xmlns:cx="http://schemas.microsoft.com/office/drawing/2014/chartex" xmlns:cx1="http://schemas.microsoft.com/office/drawing/2015/9/8/chartex" xmlns:cx2="http://schemas.microsoft.com/office/drawing/2015/10/21/chartex" xmlns:cx3="http://schemas.microsoft.com/office/drawing/2016/5/9/chartex" xmlns:cx4="http://schemas.microsoft.com/office/drawing/2016/5/10/chartex" xmlns:cx5="http://schemas.microsoft.com/office/drawing/2016/5/11/chartex" xmlns:cx6="http://schemas.microsoft.com/office/drawing/2016/5/12/chartex" xmlns:cx7="http://schemas.microsoft.com/office/drawing/2016/5/13/chartex" xmlns:cx8="http://schemas.microsoft.com/office/drawing/2016/5/14/chartex" xmlns:mc="http://schemas.openxmlformats.org/markup-compatibility/2006" xmlns:aink="http://schemas.microsoft.com/office/drawing/2016/ink" xmlns:am3d="http://schemas.microsoft.com/office/drawing/2017/model3d" xmlns:o="urn:schemas-microsoft-com:office:office" xmlns:oel="http://schemas.microsoft.com/office/2019/extlst" xmlns:r="http://schemas.openxmlformats.org/officeDocument/2006/relationships" xmlns:m="http://schemas.openxmlformats.org/officeDocument/2006/math" xmlns:v="urn:schemas-microsoft-com:vml" xmlns:wp14="http://schemas.microsoft.com/office/word/2010/wordprocessingDrawing" xmlns:wp="http://schemas.openxmlformats.org/drawingml/2006/wordprocessingDrawing" xmlns:w10="urn:schemas-microsoft-com:office:word" xmlns:w="http://schemas.openxmlformats.org/wordprocessingml/2006/main" xmlns:w14="http://schemas.microsoft.com/office/word/2010/wordml" xmlns:w15="http://schemas.microsoft.com/office/word/2012/wordml" xmlns:w16cei="http://schemas.microsoft.com/office/word/2026/wordml/cei" xmlns:w16cex="http://schemas.microsoft.com/office/word/2018/wordml/cex" xmlns:w16cid="http://schemas.microsoft.com/office/word/2016/wordml/cid" xmlns:w16="http://schemas.microsoft.com/office/word/2018/wordml" xmlns:w16du="http://schemas.microsoft.com/office/word/2023/wordml/word16du" xmlns:w16sdtdh="http://schemas.microsoft.com/office/word/2020/wordml/sdtdatahash" xmlns:w16sdtfl="http://schemas.microsoft.com/office/word/2024/wordml/sdtformatlock" xmlns:w16se="http://schemas.microsoft.com/office/word/2015/wordml/symex" xmlns:wpg="http://schemas.microsoft.com/office/word/2010/wordprocessingGroup" xmlns:wpi="http://schemas.microsoft.com/office/word/2010/wordprocessingInk" xmlns:wne="http://schemas.microsoft.com/office/word/2006/wordml" xmlns:wps="http://schemas.microsoft.com/office/word/2010/wordprocessingShape" mc:Ignorable="w14 w15 w16se w16cid w16 w16cex w16sdtdh w16sdtfl w16du wp14">
   <w:body>
     <w:p>
       <w:r>
@@ -607,23 +607,10 @@
         <w:t xml:space="preserve">Top Bar, Menu Links, Action button </w:t>
       </w:r>
       <w:r>
-        <w:t xml:space="preserve">Main headline that is bold and large, </w:t>
-      </w:r>
-      <w:proofErr w:type="gramStart"/>
-      <w:r>
-        <w:t>High resolution</w:t>
-      </w:r>
-      <w:proofErr w:type="gramEnd"/>
-      <w:r>
-        <w:t xml:space="preserve"> imagery will be used, </w:t>
-      </w:r>
-      <w:proofErr w:type="gramStart"/>
-      <w:r>
-        <w:t>Lots</w:t>
-      </w:r>
-      <w:proofErr w:type="gramEnd"/>
-      <w:r>
-        <w:t xml:space="preserve"> of whitespace to reduce visual clutter. </w:t>
+        <w:t xml:space="preserve">Main headline that is bold and large, High resolution imagery will be used, </w:t>
+      </w:r>
+      <w:r>
+        <w:t xml:space="preserve">Lots of whitespace to reduce visual clutter. </w:t>
       </w:r>
     </w:p>
     <w:p>
@@ -925,68 +912,57 @@
         <w:t>.</w:t>
       </w:r>
       <w:r>
+        <w:t xml:space="preserve"> [Accessed </w:t>
+      </w:r>
+      <w:r>
+        <w:t>06</w:t>
+      </w:r>
+      <w:r>
         <w:t xml:space="preserve"> </w:t>
       </w:r>
       <w:r>
-        <w:t xml:space="preserve">[Accessed </w:t>
-      </w:r>
-      <w:r>
-        <w:t>06</w:t>
+        <w:t>August</w:t>
+      </w:r>
+      <w:r>
+        <w:t xml:space="preserve"> 20</w:t>
+      </w:r>
+      <w:r>
+        <w:t>26</w:t>
+      </w:r>
+      <w:r>
+        <w:t>]</w:t>
+      </w:r>
+      <w:r>
+        <w:t>.</w:t>
+      </w:r>
+    </w:p>
+    <w:p>
+      <w:pPr>
+        <w:numPr>
+          <w:ilvl w:val="1"/>
+          <w:numId w:val="9"/>
+        </w:numPr>
+      </w:pPr>
+      <w:r>
+        <w:t>Brown</w:t>
+      </w:r>
+      <w:r>
+        <w:t>.</w:t>
       </w:r>
       <w:r>
         <w:t xml:space="preserve"> </w:t>
       </w:r>
       <w:r>
-        <w:t>August</w:t>
-      </w:r>
-      <w:r>
-        <w:t xml:space="preserve"> 20</w:t>
-      </w:r>
-      <w:r>
-        <w:t>26</w:t>
-      </w:r>
-      <w:r>
-        <w:t>]</w:t>
-      </w:r>
-      <w:r>
-        <w:t>.</w:t>
-      </w:r>
-    </w:p>
-    <w:p>
-      <w:pPr>
-        <w:numPr>
-          <w:ilvl w:val="1"/>
-          <w:numId w:val="9"/>
-        </w:numPr>
-      </w:pPr>
-      <w:r>
-        <w:t>Brown</w:t>
-      </w:r>
-      <w:r>
-        <w:t>.</w:t>
+        <w:t>2026.</w:t>
       </w:r>
       <w:r>
         <w:t xml:space="preserve"> </w:t>
       </w:r>
       <w:r>
-        <w:t>2026.</w:t>
-      </w:r>
-      <w:r>
-        <w:t xml:space="preserve"> </w:t>
-      </w:r>
-      <w:r>
         <w:t>Top 15 Black Red Color Palettes for Creative Projects With Hex Codes</w:t>
       </w:r>
       <w:r>
-        <w:t xml:space="preserve">. </w:t>
-      </w:r>
-      <w:proofErr w:type="gramStart"/>
-      <w:r>
-        <w:t>[</w:t>
-      </w:r>
-      <w:proofErr w:type="gramEnd"/>
-      <w:r>
-        <w:t xml:space="preserve">Online]. Available at: </w:t>
+        <w:t xml:space="preserve">. [Online]. Available at: </w:t>
       </w:r>
       <w:hyperlink r:id="rId11" w:history="1">
         <w:r>
@@ -1032,13 +1008,16 @@
         </w:numPr>
       </w:pPr>
       <w:r>
-        <w:t>Landing</w:t>
-      </w:r>
-      <w:r>
-        <w:t xml:space="preserve"> example</w:t>
-      </w:r>
-      <w:r>
-        <w:t xml:space="preserve"> 1:  </w:t>
+        <w:t>2026</w:t>
+      </w:r>
+      <w:r>
+        <w:t>.C</w:t>
+      </w:r>
+      <w:r>
+        <w:t>yberon – Website Template</w:t>
+      </w:r>
+      <w:r>
+        <w:t xml:space="preserve">. [Online]. Available at: </w:t>
       </w:r>
       <w:hyperlink r:id="rId12" w:history="1">
         <w:r>
@@ -1084,78 +1063,32 @@
         </w:numPr>
       </w:pPr>
       <w:r>
-        <w:t>2026</w:t>
-      </w:r>
-      <w:r>
-        <w:t>.C</w:t>
-      </w:r>
-      <w:r>
-        <w:t>yberon – Website Template</w:t>
-      </w:r>
-      <w:r>
-        <w:t xml:space="preserve">. [Online]. Available at: </w:t>
+        <w:t>2026.Landing page travel with photo</w:t>
+      </w:r>
+      <w:r>
+        <w:t>. [Online]. Available at: Landing example 2:</w:t>
+      </w:r>
+      <w:r>
+        <w:t xml:space="preserve"> </w:t>
       </w:r>
       <w:hyperlink r:id="rId13" w:history="1">
         <w:r>
           <w:rPr>
             <w:rStyle w:val="Hyperlink"/>
           </w:rPr>
-          <w:t>https://cdn.dribbble.com/userupload/47392796/file/a10fdfc500bf47377fae69015243a5d6.png?resize=400x0</w:t>
+          <w:t>https://img.magnific.com/free-vector/landing-page-travel-with-photo_23-2148378025.jpg?semt=ais_</w:t>
         </w:r>
-      </w:hyperlink>
-      <w:r>
-        <w:t>.</w:t>
-      </w:r>
-      <w:r>
-        <w:t xml:space="preserve"> [Accessed </w:t>
-      </w:r>
-      <w:r>
-        <w:t>06</w:t>
-      </w:r>
-      <w:r>
-        <w:t xml:space="preserve"> </w:t>
-      </w:r>
-      <w:r>
-        <w:t>August</w:t>
-      </w:r>
-      <w:r>
-        <w:t xml:space="preserve"> 20</w:t>
-      </w:r>
-      <w:r>
-        <w:t>26</w:t>
-      </w:r>
-      <w:r>
-        <w:t>]</w:t>
-      </w:r>
-      <w:r>
-        <w:t>.</w:t>
-      </w:r>
-    </w:p>
-    <w:p>
-      <w:pPr>
-        <w:numPr>
-          <w:ilvl w:val="1"/>
-          <w:numId w:val="9"/>
-        </w:numPr>
-      </w:pPr>
-      <w:r>
-        <w:t>2026.Landing page travel with photo</w:t>
-      </w:r>
-      <w:r>
-        <w:t xml:space="preserve">. [Online]. Available at: </w:t>
-      </w:r>
-      <w:r>
-        <w:t>Landing example 2:</w:t>
-      </w:r>
-      <w:r>
-        <w:t xml:space="preserve"> </w:t>
-      </w:r>
-      <w:hyperlink r:id="rId14" w:history="1">
         <w:r>
           <w:rPr>
             <w:rStyle w:val="Hyperlink"/>
           </w:rPr>
-          <w:t>https://img.magnific.com/free-vector/landing-page-travel-with-photo_23-2148378025.jpg?semt=ais_hybrid&amp;w=740&amp;q=80</w:t>
+          <w:t>h</w:t>
+        </w:r>
+        <w:r>
+          <w:rPr>
+            <w:rStyle w:val="Hyperlink"/>
+          </w:rPr>
+          <w:t>ybrid&amp;w=740&amp;q=80</w:t>
         </w:r>
       </w:hyperlink>
       <w:r>
@@ -1189,7 +1122,287 @@
         <w:t>.</w:t>
       </w:r>
     </w:p>
+    <w:p>
+      <w:pPr>
+        <w:numPr>
+          <w:ilvl w:val="1"/>
+          <w:numId w:val="9"/>
+        </w:numPr>
+      </w:pPr>
+    </w:p>
+    <w:p>
+      <w:pPr>
+        <w:pStyle w:val="ListParagraph"/>
+        <w:numPr>
+          <w:ilvl w:val="1"/>
+          <w:numId w:val="9"/>
+        </w:numPr>
+      </w:pPr>
+      <w:r>
+        <w:t xml:space="preserve">G., Q. 2020. People sitting on chairs in front of table [image online]. Unsplash. Available at: https://unsplash.com/photos/people-sitting-on-chairs-in-front-of-table-Qngdf0kgGB4 [Accessed </w:t>
+      </w:r>
+      <w:r>
+        <w:t>1</w:t>
+      </w:r>
+      <w:r>
+        <w:t>2</w:t>
+      </w:r>
+      <w:r>
+        <w:t xml:space="preserve"> August 2026].</w:t>
+      </w:r>
+    </w:p>
     <w:p/>
+    <w:p>
+      <w:pPr>
+        <w:pStyle w:val="ListParagraph"/>
+        <w:numPr>
+          <w:ilvl w:val="1"/>
+          <w:numId w:val="9"/>
+        </w:numPr>
+      </w:pPr>
+      <w:r>
+        <w:t>García, E. 2021. Two men shaking hands over a house model and keys [image online]. Unsplash. Available at: https://unsplash.com/photos/two-men-shaking-hands-over-a-house-model-and-keys-69K2AGQc_Yw [Accessed 1</w:t>
+      </w:r>
+      <w:r>
+        <w:t>2</w:t>
+      </w:r>
+      <w:r>
+        <w:t xml:space="preserve"> August 2026].</w:t>
+      </w:r>
+    </w:p>
+    <w:p/>
+    <w:p>
+      <w:pPr>
+        <w:pStyle w:val="ListParagraph"/>
+        <w:numPr>
+          <w:ilvl w:val="1"/>
+          <w:numId w:val="9"/>
+        </w:numPr>
+      </w:pPr>
+      <w:r>
+        <w:t>Grounded Goals. 2021. White and red wooden house beside grey framed magnifying glass [image online]. Unsplash. Available at: https://unsplash.com/photos/white-and-red-wooden-house-beside-grey-framed-magnifying-glass-NpTbVOkkom8 [Accessed 1</w:t>
+      </w:r>
+      <w:r>
+        <w:t>2</w:t>
+      </w:r>
+      <w:r>
+        <w:t xml:space="preserve"> August 2026].</w:t>
+      </w:r>
+    </w:p>
+    <w:p/>
+    <w:p>
+      <w:pPr>
+        <w:pStyle w:val="ListParagraph"/>
+        <w:numPr>
+          <w:ilvl w:val="1"/>
+          <w:numId w:val="9"/>
+        </w:numPr>
+      </w:pPr>
+      <w:r>
+        <w:lastRenderedPageBreak/>
+        <w:t>Jakobsson, J. 2019. Turned on pendant lamps above kitchen island [image online]. Unsplash. Available at: https://unsplash.com/photos/turned-on-pendant-lamps-above-kitchen-island-FJZtZldA-uE [Accessed 1</w:t>
+      </w:r>
+      <w:r>
+        <w:t>2</w:t>
+      </w:r>
+      <w:r>
+        <w:t xml:space="preserve"> August 2026].</w:t>
+      </w:r>
+    </w:p>
+    <w:p/>
+    <w:p>
+      <w:pPr>
+        <w:pStyle w:val="ListParagraph"/>
+        <w:numPr>
+          <w:ilvl w:val="1"/>
+          <w:numId w:val="9"/>
+        </w:numPr>
+      </w:pPr>
+      <w:r>
+        <w:t>McQue, A. 2021. Living room with tan leather sectional sofa [image online]. Unsplash. Available at: https://unsplash.com/photos/living-room-with-tan-leather-sectional-sofa-umAXneH4GhA [Accessed 1</w:t>
+      </w:r>
+      <w:r>
+        <w:t>2</w:t>
+      </w:r>
+      <w:r>
+        <w:t xml:space="preserve"> August 2026].</w:t>
+      </w:r>
+    </w:p>
+    <w:p/>
+    <w:p>
+      <w:pPr>
+        <w:pStyle w:val="ListParagraph"/>
+        <w:numPr>
+          <w:ilvl w:val="1"/>
+          <w:numId w:val="9"/>
+        </w:numPr>
+      </w:pPr>
+      <w:r>
+        <w:t>OpenClipart-Vectors. 2017. Logo blue free [image online]. Pixabay. Available at: https://pixabay.com/vectors/logo-blue-free-2067396/ [Accessed 1</w:t>
+      </w:r>
+      <w:r>
+        <w:t>2</w:t>
+      </w:r>
+      <w:r>
+        <w:t xml:space="preserve"> </w:t>
+      </w:r>
+      <w:r>
+        <w:t>August 2026].</w:t>
+      </w:r>
+    </w:p>
+    <w:p/>
+    <w:p>
+      <w:pPr>
+        <w:pStyle w:val="ListParagraph"/>
+        <w:numPr>
+          <w:ilvl w:val="1"/>
+          <w:numId w:val="9"/>
+        </w:numPr>
+      </w:pPr>
+      <w:r>
+        <w:t>Page, C. 2021. A wooden table topped with lots of papers [image online]. Unsplash. Available at: https://unsplash.com/photos/a-wooden-table-topped-with-lots-of-papers-IzFXEH0jb0w [Accessed 1</w:t>
+      </w:r>
+      <w:r>
+        <w:t xml:space="preserve">2 </w:t>
+      </w:r>
+      <w:r>
+        <w:t>August 2026].</w:t>
+      </w:r>
+    </w:p>
+    <w:p/>
+    <w:p>
+      <w:pPr>
+        <w:pStyle w:val="ListParagraph"/>
+        <w:numPr>
+          <w:ilvl w:val="1"/>
+          <w:numId w:val="9"/>
+        </w:numPr>
+      </w:pPr>
+      <w:r>
+        <w:t>R., S. 2022. A modern recording studio with soundproofing and large window [image online]. Unsplash. Available at: https://unsplash.com/photos/a-modern-recording-studio-with-soundproofing-and-large-window-EYQ6vraGu_I [Accessed 1</w:t>
+      </w:r>
+      <w:r>
+        <w:t>2</w:t>
+      </w:r>
+      <w:r>
+        <w:t xml:space="preserve"> August 2026].</w:t>
+      </w:r>
+    </w:p>
+    <w:p/>
+    <w:p>
+      <w:pPr>
+        <w:pStyle w:val="ListParagraph"/>
+        <w:numPr>
+          <w:ilvl w:val="1"/>
+          <w:numId w:val="9"/>
+        </w:numPr>
+      </w:pPr>
+      <w:r>
+        <w:t>S., J. 2020. White ceramic sink with mirror [image online]. Unsplash. Available at: https://unsplash.com/photos/white ceramic-sink-with-mirror-1AF5hP6F4tI [Accessed 1</w:t>
+      </w:r>
+      <w:r>
+        <w:t xml:space="preserve">2 </w:t>
+      </w:r>
+      <w:r>
+        <w:t>August 2026].</w:t>
+      </w:r>
+    </w:p>
+    <w:p/>
+    <w:p>
+      <w:pPr>
+        <w:pStyle w:val="ListParagraph"/>
+        <w:numPr>
+          <w:ilvl w:val="1"/>
+          <w:numId w:val="9"/>
+        </w:numPr>
+      </w:pPr>
+      <w:r>
+        <w:t>S., J. 2020. A modern kitchen with stainless steel appliances and marble counter tops [image online]. Unsplash. Available at: https://unsplash.com/photos/a-modern-kitchen-with-stainless-steel-appliances-and-marble-counter-tops-j6QSUeiW6vo [Accessed 1</w:t>
+      </w:r>
+      <w:r>
+        <w:t>2</w:t>
+      </w:r>
+      <w:r>
+        <w:t xml:space="preserve"> August 2026].</w:t>
+      </w:r>
+    </w:p>
+    <w:p/>
+    <w:p>
+      <w:pPr>
+        <w:pStyle w:val="ListParagraph"/>
+        <w:numPr>
+          <w:ilvl w:val="1"/>
+          <w:numId w:val="9"/>
+        </w:numPr>
+      </w:pPr>
+      <w:r>
+        <w:t>S., J. 2021. Modern home with pool and outdoor seating area [image online]. Unsplash. Available at: https://unsplash.com/photos/modern-home-with-pool-and-outdoor-seating-area-_ELoYrhi3ao [Accessed 1</w:t>
+      </w:r>
+      <w:r>
+        <w:t>2</w:t>
+      </w:r>
+      <w:r>
+        <w:t xml:space="preserve"> August 2026].</w:t>
+      </w:r>
+    </w:p>
+    <w:p/>
+    <w:p>
+      <w:pPr>
+        <w:pStyle w:val="ListParagraph"/>
+        <w:numPr>
+          <w:ilvl w:val="1"/>
+          <w:numId w:val="9"/>
+        </w:numPr>
+      </w:pPr>
+      <w:r>
+        <w:lastRenderedPageBreak/>
+        <w:t>S., J. 2021. A modern bedroom with a stylish neutral aesthetic [image online]. Unsplash. Available at: https://unsplash.com/photos/a-modern-bedroom-with-a-stylish-neutral-aesthetic-0tVimluL_ls [Accessed 1</w:t>
+      </w:r>
+      <w:r>
+        <w:t>2</w:t>
+      </w:r>
+      <w:r>
+        <w:t xml:space="preserve"> August 2026].</w:t>
+      </w:r>
+    </w:p>
+    <w:p/>
+    <w:p>
+      <w:pPr>
+        <w:pStyle w:val="ListParagraph"/>
+        <w:numPr>
+          <w:ilvl w:val="1"/>
+          <w:numId w:val="9"/>
+        </w:numPr>
+      </w:pPr>
+      <w:r>
+        <w:t>Tavernier, R. 2019. White wooden framed glass window [image online]. Unsplash. Available at: https://unsplash.com/photos/white-wooden-framed-glass-window-iwETrUY3byM [Accessed 1</w:t>
+      </w:r>
+      <w:r>
+        <w:t>2</w:t>
+      </w:r>
+      <w:r>
+        <w:t xml:space="preserve"> August 2026].</w:t>
+      </w:r>
+    </w:p>
+    <w:p/>
+    <w:p>
+      <w:pPr>
+        <w:pStyle w:val="ListParagraph"/>
+        <w:numPr>
+          <w:ilvl w:val="1"/>
+          <w:numId w:val="9"/>
+        </w:numPr>
+      </w:pPr>
+      <w:r>
+        <w:t>Tyler, T. 2020. Man in suit talking on phone at desk with laptop [image online]. Unsplash. Available at: https://unsplash.com/photos/man-in-suit-talking-on-phone-at-desk-with-laptop-NWT8Hya-_WQ [Accessed 1</w:t>
+      </w:r>
+      <w:r>
+        <w:t>2</w:t>
+      </w:r>
+      <w:r>
+        <w:t xml:space="preserve"> August 2026].</w:t>
+      </w:r>
+    </w:p>
     <w:sectPr>
       <w:pgSz w:w="11906" w:h="16838"/>
       <w:pgMar w:top="1440" w:right="1440" w:bottom="1440" w:left="1440" w:header="708" w:footer="708" w:gutter="0"/>
@@ -1201,7 +1414,7 @@
 </file>
 
 <file path=word/numbering.xml><?xml version="1.0" encoding="utf-8"?>
-<w:numbering xmlns:wpc="http://schemas.microsoft.com/office/word/2010/wordprocessingCanvas" xmlns:cx="http://schemas.microsoft.com/office/drawing/2014/chartex" xmlns:cx1="http://schemas.microsoft.com/office/drawing/2015/9/8/chartex" xmlns:cx2="http://schemas.microsoft.com/office/drawing/2015/10/21/chartex" xmlns:cx3="http://schemas.microsoft.com/office/drawing/2016/5/9/chartex" xmlns:cx4="http://schemas.microsoft.com/office/drawing/2016/5/10/chartex" xmlns:cx5="http://schemas.microsoft.com/office/drawing/2016/5/11/chartex" xmlns:cx6="http://schemas.microsoft.com/office/drawing/2016/5/12/chartex" xmlns:cx7="http://schemas.microsoft.com/office/drawing/2016/5/13/chartex" xmlns:cx8="http://schemas.microsoft.com/office/drawing/2016/5/14/chartex" xmlns:mc="http://schemas.openxmlformats.org/markup-compatibility/2006" xmlns:aink="http://schemas.microsoft.com/office/drawing/2016/ink" xmlns:am3d="http://schemas.microsoft.com/office/drawing/2017/model3d" xmlns:o="urn:schemas-microsoft-com:office:office" xmlns:oel="http://schemas.microsoft.com/office/2019/extlst" xmlns:r="http://schemas.openxmlformats.org/officeDocument/2006/relationships" xmlns:m="http://schemas.openxmlformats.org/officeDocument/2006/math" xmlns:v="urn:schemas-microsoft-com:vml" xmlns:wp14="http://schemas.microsoft.com/office/word/2010/wordprocessingDrawing" xmlns:wp="http://schemas.openxmlformats.org/drawingml/2006/wordprocessingDrawing" xmlns:w10="urn:schemas-microsoft-com:office:word" xmlns:w="http://schemas.openxmlformats.org/wordprocessingml/2006/main" xmlns:w14="http://schemas.microsoft.com/office/word/2010/wordml" xmlns:w15="http://schemas.microsoft.com/office/word/2012/wordml" xmlns:w16cex="http://schemas.microsoft.com/office/word/2018/wordml/cex" xmlns:w16cid="http://schemas.microsoft.com/office/word/2016/wordml/cid" xmlns:w16="http://schemas.microsoft.com/office/word/2018/wordml" xmlns:w16du="http://schemas.microsoft.com/office/word/2023/wordml/word16du" xmlns:w16sdtdh="http://schemas.microsoft.com/office/word/2020/wordml/sdtdatahash" xmlns:w16sdtfl="http://schemas.microsoft.com/office/word/2024/wordml/sdtformatlock" xmlns:w16se="http://schemas.microsoft.com/office/word/2015/wordml/symex" xmlns:wpg="http://schemas.microsoft.com/office/word/2010/wordprocessingGroup" xmlns:wpi="http://schemas.microsoft.com/office/word/2010/wordprocessingInk" xmlns:wne="http://schemas.microsoft.com/office/word/2006/wordml" xmlns:wps="http://schemas.microsoft.com/office/word/2010/wordprocessingShape" mc:Ignorable="w14 w15 w16se w16cid w16 w16cex w16sdtdh w16sdtfl w16du wp14">
+<w:numbering xmlns:wpc="http://schemas.microsoft.com/office/word/2010/wordprocessingCanvas" xmlns:cx="http://schemas.microsoft.com/office/drawing/2014/chartex" xmlns:cx1="http://schemas.microsoft.com/office/drawing/2015/9/8/chartex" xmlns:cx2="http://schemas.microsoft.com/office/drawing/2015/10/21/chartex" xmlns:cx3="http://schemas.microsoft.com/office/drawing/2016/5/9/chartex" xmlns:cx4="http://schemas.microsoft.com/office/drawing/2016/5/10/chartex" xmlns:cx5="http://schemas.microsoft.com/office/drawing/2016/5/11/chartex" xmlns:cx6="http://schemas.microsoft.com/office/drawing/2016/5/12/chartex" xmlns:cx7="http://schemas.microsoft.com/office/drawing/2016/5/13/chartex" xmlns:cx8="http://schemas.microsoft.com/office/drawing/2016/5/14/chartex" xmlns:mc="http://schemas.openxmlformats.org/markup-compatibility/2006" xmlns:aink="http://schemas.microsoft.com/office/drawing/2016/ink" xmlns:am3d="http://schemas.microsoft.com/office/drawing/2017/model3d" xmlns:o="urn:schemas-microsoft-com:office:office" xmlns:oel="http://schemas.microsoft.com/office/2019/extlst" xmlns:r="http://schemas.openxmlformats.org/officeDocument/2006/relationships" xmlns:m="http://schemas.openxmlformats.org/officeDocument/2006/math" xmlns:v="urn:schemas-microsoft-com:vml" xmlns:wp14="http://schemas.microsoft.com/office/word/2010/wordprocessingDrawing" xmlns:wp="http://schemas.openxmlformats.org/drawingml/2006/wordprocessingDrawing" xmlns:w10="urn:schemas-microsoft-com:office:word" xmlns:w="http://schemas.openxmlformats.org/wordprocessingml/2006/main" xmlns:w14="http://schemas.microsoft.com/office/word/2010/wordml" xmlns:w15="http://schemas.microsoft.com/office/word/2012/wordml" xmlns:w16cei="http://schemas.microsoft.com/office/word/2026/wordml/cei" xmlns:w16cex="http://schemas.microsoft.com/office/word/2018/wordml/cex" xmlns:w16cid="http://schemas.microsoft.com/office/word/2016/wordml/cid" xmlns:w16="http://schemas.microsoft.com/office/word/2018/wordml" xmlns:w16du="http://schemas.microsoft.com/office/word/2023/wordml/word16du" xmlns:w16sdtdh="http://schemas.microsoft.com/office/word/2020/wordml/sdtdatahash" xmlns:w16sdtfl="http://schemas.microsoft.com/office/word/2024/wordml/sdtformatlock" xmlns:w16se="http://schemas.microsoft.com/office/word/2015/wordml/symex" xmlns:wpg="http://schemas.microsoft.com/office/word/2010/wordprocessingGroup" xmlns:wpi="http://schemas.microsoft.com/office/word/2010/wordprocessingInk" xmlns:wne="http://schemas.microsoft.com/office/word/2006/wordml" xmlns:wps="http://schemas.microsoft.com/office/word/2010/wordprocessingShape" mc:Ignorable="w14 w15 w16se w16cid w16 w16cex w16sdtdh w16sdtfl w16du wp14">
   <w:abstractNum w:abstractNumId="0" w15:restartNumberingAfterBreak="0">
     <w:nsid w:val="1C355766"/>
     <w:multiLevelType w:val="hybridMultilevel"/>
@@ -1297,7 +1510,7 @@
   <w:abstractNum w:abstractNumId="1" w15:restartNumberingAfterBreak="0">
     <w:nsid w:val="210C021B"/>
     <w:multiLevelType w:val="hybridMultilevel"/>
-    <w:tmpl w:val="1032AD0C"/>
+    <w:tmpl w:val="DE26F6A2"/>
     <w:lvl w:ilvl="0" w:tplc="FFFFFFFF">
       <w:start w:val="1"/>
       <w:numFmt w:val="bullet"/>
@@ -2248,6 +2461,9 @@
   </w:num>
   <w:num w:numId="9" w16cid:durableId="1712458177">
     <w:abstractNumId w:val="1"/>
+  </w:num>
+  <w:num w:numId="10" w16cid:durableId="1400129407">
+    <w:abstractNumId w:val="0"/>
   </w:num>
 </w:numbering>
 </file>
@@ -2855,6 +3071,7 @@
   <w:style w:type="character" w:default="1" w:styleId="DefaultParagraphFont">
     <w:name w:val="Default Paragraph Font"/>
     <w:uiPriority w:val="1"/>
+    <w:semiHidden/>
     <w:unhideWhenUsed/>
   </w:style>
   <w:style w:type="table" w:default="1" w:styleId="TableNormal">

</xml_diff>